<commit_message>
Integrated handoff: project record and numbers-test models now on GitHub
Claude-Session: https://claude.ai/code/session_01MinGEGn6eBTPUff1swBF2k
</commit_message>
<xml_diff>
--- a/INTEGRATED_HANDOFF_2026-10-21/00_START_HERE_Integrated_Handoff.docx
+++ b/INTEGRATED_HANDOFF_2026-10-21/00_START_HERE_Integrated_Handoff.docx
@@ -570,7 +570,7 @@
               <w:jc w:val="left"/>
             </w:pPr>
             <w:r>
-              <w:t xml:space="preserve">Stopped by you; asked to push its last unsaved files, then stand down</w:t>
+              <w:t xml:space="preserve">Stopped by you. Pushed its last unsaved files on 21 Oct (46400ff, af8bc57) and stood down</w:t>
             </w:r>
           </w:p>
         </w:tc>
@@ -1445,20 +1445,7 @@
               <w:jc w:val="left"/>
             </w:pPr>
             <w:r>
-              <w:t xml:space="preserve">Full record of 17-21 Oct. </w:t>
-            </w:r>
-            <w:r>
-              <w:rPr>
-                <w:bCs/>
-                <w:b/>
-              </w:rPr>
-              <w:t xml:space="preserve">The report itself is missing from GitHub</w:t>
-            </w:r>
-            <w:r>
-              <w:t xml:space="preserve"> </w:t>
-            </w:r>
-            <w:r>
-              <w:t xml:space="preserve">(see below)</w:t>
+              <w:t xml:space="preserve">Full record of 17-21 Oct: the report in PDF, Word, text and Markdown, privacy- and fact-checked</w:t>
             </w:r>
           </w:p>
         </w:tc>
@@ -2640,35 +2627,13 @@
           <w:bCs/>
           <w:b/>
         </w:rPr>
-        <w:t xml:space="preserve">Project record report:</w:t>
+        <w:t xml:space="preserve">Fixed on 21 Oct:</w:t>
       </w:r>
       <w:r>
         <w:t xml:space="preserve"> </w:t>
       </w:r>
       <w:r>
-        <w:t xml:space="preserve">the folder’s guide lists the report (PDF, Word, text, email parts, checks), but only the guide and build scripts are on GitHub. The old session was asked on 21 Oct to push the rest.</w:t>
-      </w:r>
-    </w:p>
-    <w:p>
-      <w:pPr>
-        <w:numPr>
-          <w:ilvl w:val="0"/>
-          <w:numId w:val="1008"/>
-        </w:numPr>
-        <w:pStyle w:val="Compact"/>
-      </w:pPr>
-      <w:r>
-        <w:rPr>
-          <w:bCs/>
-          <w:b/>
-        </w:rPr>
-        <w:t xml:space="preserve">Numbers-test models:</w:t>
-      </w:r>
-      <w:r>
-        <w:t xml:space="preserve"> </w:t>
-      </w:r>
-      <w:r>
-        <w:t xml:space="preserve">the 3 finished models were saved only on the old session’s machine. They were requested the same way. Without them, those 3 must be retrained (about 30 minutes) when the test resumes.</w:t>
+        <w:t xml:space="preserve">the project record report and the 3 finished numbers-test models were only on the old session’s machine. Both are now on GitHub (commits 46400ff and af8bc57). The numbers test can resume from model 4 in any session. The record’s unchecked draft sections were held back on purpose, because they were never privacy-checked.</w:t>
       </w:r>
     </w:p>
     <w:p>
@@ -3637,46 +3602,6 @@
       </w:r>
       <w:r>
         <w:t xml:space="preserve">a cloud session can’t place files on your devices. The files are sent to you in the app to save.</w:t>
-      </w:r>
-    </w:p>
-    <w:p>
-      <w:pPr>
-        <w:numPr>
-          <w:ilvl w:val="0"/>
-          <w:numId w:val="1011"/>
-        </w:numPr>
-        <w:pStyle w:val="Compact"/>
-      </w:pPr>
-      <w:r>
-        <w:rPr>
-          <w:bCs/>
-          <w:b/>
-        </w:rPr>
-        <w:t xml:space="preserve">The old session:</w:t>
-      </w:r>
-      <w:r>
-        <w:t xml:space="preserve"> </w:t>
-      </w:r>
-      <w:r>
-        <w:t xml:space="preserve">whether it pushes its last files depends on it running again. If it doesn’t, the items in</w:t>
-      </w:r>
-      <w:r>
-        <w:t xml:space="preserve"> </w:t>
-      </w:r>
-      <w:r>
-        <w:t xml:space="preserve">“</w:t>
-      </w:r>
-      <w:r>
-        <w:t xml:space="preserve">Still missing</w:t>
-      </w:r>
-      <w:r>
-        <w:t xml:space="preserve">”</w:t>
-      </w:r>
-      <w:r>
-        <w:t xml:space="preserve"> </w:t>
-      </w:r>
-      <w:r>
-        <w:t xml:space="preserve">stay missing.</w:t>
       </w:r>
     </w:p>
     <w:bookmarkEnd w:id="31"/>

</xml_diff>